<commit_message>
docs(docx): entity identity + factual corrections across 24 Word documents
Batch (run-merged, XSD-validated): retire 'Fly GACA Saudi Arabia (LLC)'
/ 'trading as' identities, resolve [CR_NUMBER]/[COMPANY_ADDRESS], stamp
the company into the shared contact block. Preserved: the academy's
[CR NUMBER] in the 60-day pilot and the employee [IBAN_NUMBER] in the
employment contract. Targeted content fixes: banking policy → Arab
National Bank via SiFi; VAT memo → registered status + overdue first
return; tax calendar → MISA not applicable (60k SAR line corrected);
investor FAQ Q26 + DDQ → CR issued 23/09/2022 (was 'filed April 2026').

Co-Authored-By: Claude Fable 5 <noreply@anthropic.com>
Claude-Session: https://claude.ai/code/session_014HRoE5aiBRiifvxyiWKonn
</commit_message>
<xml_diff>
--- a/01-governance/founders-agreement.docx
+++ b/01-governance/founders-agreement.docx
@@ -341,7 +341,7 @@
           <w:sz w:val="22"/>
           <w:szCs w:val="22"/>
         </w:rPr>
-        <w:t xml:space="preserve">Legal name: [COMPANY_FULL_ARABIC_NAME] / Fly GACA Saudi Arabia</w:t>
+        <w:t xml:space="preserve">Legal name: شركة بدع الدولية / BDA Company International</w:t>
       </w:r>
     </w:p>
     <w:p>
@@ -377,7 +377,7 @@
           <w:sz w:val="22"/>
           <w:szCs w:val="22"/>
         </w:rPr>
-        <w:t xml:space="preserve">Commercial Registration No.: [CR_NUMBER]</w:t>
+        <w:t xml:space="preserve">Commercial Registration No.: 7030976893</w:t>
       </w:r>
     </w:p>
     <w:p>

</xml_diff>